<commit_message>
docs: add planning and development documents
</commit_message>
<xml_diff>
--- a/docs/개발문서.docx
+++ b/docs/개발문서.docx
@@ -4100,6 +4100,103 @@
     </w:p>
     <w:p>
       <w:pPr>
+        <w:spacing w:before="160" w:after="120"/>
+      </w:pPr>
+      <w:r>
+        <w:rPr>
+          <w:rFonts w:ascii="맑은 고딕" w:hAnsi="맑은 고딕" w:eastAsia="맑은 고딕"/>
+          <w:b/>
+          <w:color w:val="1F2D3D"/>
+          <w:sz w:val="26"/>
+        </w:rPr>
+        <w:t>8.7 레슨의 전파: CLAUDE.md를 통한 반복 실수 제거</w:t>
+      </w:r>
+    </w:p>
+    <w:p>
+      <w:pPr>
+        <w:pStyle w:val="ListBullet"/>
+        <w:spacing w:after="40" w:line="324" w:lineRule="auto"/>
+      </w:pPr>
+      <w:r>
+        <w:rPr>
+          <w:rFonts w:ascii="맑은 고딕" w:hAnsi="맑은 고딕" w:eastAsia="맑은 고딕"/>
+          <w:b w:val="0"/>
+          <w:sz w:val="22"/>
+        </w:rPr>
+        <w:t>Interface Hub 개발 중 Prisma 7, Recharts, shadcn/ui, Turso 등 여러 지점에서 예상치 못한 이슈를 만났다.</w:t>
+      </w:r>
+    </w:p>
+    <w:p>
+      <w:pPr>
+        <w:pStyle w:val="ListBullet"/>
+        <w:spacing w:after="40" w:line="324" w:lineRule="auto"/>
+      </w:pPr>
+      <w:r>
+        <w:rPr>
+          <w:rFonts w:ascii="맑은 고딕" w:hAnsi="맑은 고딕" w:eastAsia="맑은 고딕"/>
+          <w:b w:val="0"/>
+          <w:sz w:val="22"/>
+        </w:rPr>
+        <w:t>단순히 해결하고 넘어가는 대신, 각 이슈와 해결 방식을 CLAUDE.md에 '프로젝트별 환경 메모' 형식으로 기록했다.</w:t>
+      </w:r>
+    </w:p>
+    <w:p>
+      <w:pPr>
+        <w:pStyle w:val="ListBullet"/>
+        <w:spacing w:after="40" w:line="324" w:lineRule="auto"/>
+      </w:pPr>
+      <w:r>
+        <w:rPr>
+          <w:rFonts w:ascii="맑은 고딕" w:hAnsi="맑은 고딕" w:eastAsia="맑은 고딕"/>
+          <w:b w:val="0"/>
+          <w:sz w:val="22"/>
+        </w:rPr>
+        <w:t>이후 같은 기술 스택으로 자매 프로젝트 Cost Compass를 시작할 때 CLAUDE.md를 복사하고 프로젝트 컨텍스트만 교체했다.</w:t>
+      </w:r>
+    </w:p>
+    <w:p>
+      <w:pPr>
+        <w:pStyle w:val="ListBullet"/>
+        <w:spacing w:after="40" w:line="324" w:lineRule="auto"/>
+      </w:pPr>
+      <w:r>
+        <w:rPr>
+          <w:rFonts w:ascii="맑은 고딕" w:hAnsi="맑은 고딕" w:eastAsia="맑은 고딕"/>
+          <w:b w:val="0"/>
+          <w:sz w:val="22"/>
+        </w:rPr>
+        <w:t>결과: Interface Hub에서 겪은 11개 이슈 중 9개가 Cost Compass Phase 0~3에서 재발하지 않았다. Phase 1 DB 셋업은 Interface Hub보다 약 절반 시간에 완료됐다.</w:t>
+      </w:r>
+    </w:p>
+    <w:p>
+      <w:pPr>
+        <w:pStyle w:val="ListBullet"/>
+        <w:spacing w:after="40" w:line="324" w:lineRule="auto"/>
+      </w:pPr>
+      <w:r>
+        <w:rPr>
+          <w:rFonts w:ascii="맑은 고딕" w:hAnsi="맑은 고딕" w:eastAsia="맑은 고딕"/>
+          <w:b w:val="0"/>
+          <w:sz w:val="22"/>
+        </w:rPr>
+        <w:t>이것이 바이브코딩이 단순한 AI 코드 생성과 다른 이유다. 프롬프트 엔지니어링만큼이나 CLAUDE.md 같은 컨텍스트 문서의 설계가 중요하다.</w:t>
+      </w:r>
+    </w:p>
+    <w:p>
+      <w:pPr>
+        <w:spacing w:after="120" w:line="336" w:lineRule="auto"/>
+      </w:pPr>
+      <w:r>
+        <w:rPr>
+          <w:rFonts w:ascii="맑은 고딕" w:hAnsi="맑은 고딕" w:eastAsia="맑은 고딕"/>
+          <w:b/>
+          <w:sz w:val="22"/>
+        </w:rPr>
+        <w:t>AI는 기억하지 못하지만, 개발자가 남긴 CLAUDE.md는 다음 세션에서 다시 읽힌다.</w:t>
+      </w:r>
+    </w:p>
+    <w:p>
+      <w:pPr>
         <w:spacing w:before="280" w:after="120"/>
       </w:pPr>
       <w:r>
@@ -4507,6 +4604,125 @@
           <w:sz w:val="22"/>
         </w:rPr>
         <w:t>해결: 주석 필터를 라인 단위로 선분리하도록 바꿨다. 먼저 '--'로 시작하는 라인을 제거한 뒤, 남은 SQL을 세미콜론 기준으로 분리한다. 동시에 과거 실패 기록을 초기화하는 scripts/turso-reset.ts를 추가해 재시도 경로를 명확히 했다.</w:t>
+      </w:r>
+    </w:p>
+    <w:p>
+      <w:pPr>
+        <w:spacing w:before="160" w:after="120"/>
+      </w:pPr>
+      <w:r>
+        <w:rPr>
+          <w:rFonts w:ascii="맑은 고딕" w:hAnsi="맑은 고딕" w:eastAsia="맑은 고딕"/>
+          <w:b/>
+          <w:color w:val="1F2D3D"/>
+          <w:sz w:val="26"/>
+        </w:rPr>
+        <w:t>10.4 Prisma 7 모델 타입명 규약</w:t>
+      </w:r>
+    </w:p>
+    <w:p>
+      <w:pPr>
+        <w:spacing w:after="120" w:line="336" w:lineRule="auto"/>
+      </w:pPr>
+      <w:r>
+        <w:rPr>
+          <w:rFonts w:ascii="맑은 고딕" w:hAnsi="맑은 고딕" w:eastAsia="맑은 고딕"/>
+          <w:b w:val="0"/>
+          <w:sz w:val="22"/>
+        </w:rPr>
+        <w:t>증상: lib/actions/*.ts에서 import type { Project, Division } from "@/lib/generated/prisma/models" 선언이 TS2305 'no exported member Project' 에러를 냈다.</w:t>
+      </w:r>
+    </w:p>
+    <w:p>
+      <w:pPr>
+        <w:spacing w:after="120" w:line="336" w:lineRule="auto"/>
+      </w:pPr>
+      <w:r>
+        <w:rPr>
+          <w:rFonts w:ascii="맑은 고딕" w:hAnsi="맑은 고딕" w:eastAsia="맑은 고딕"/>
+          <w:b w:val="0"/>
+          <w:sz w:val="22"/>
+        </w:rPr>
+        <w:t>원인: Prisma 7 Preview에서 생성되는 모델 타입에는 'Model' 접미사가 붙는다. 실제 export는 ProjectModel, DivisionModel, CostItemModel 등이다.</w:t>
+      </w:r>
+    </w:p>
+    <w:p>
+      <w:pPr>
+        <w:spacing w:after="120" w:line="336" w:lineRule="auto"/>
+      </w:pPr>
+      <w:r>
+        <w:rPr>
+          <w:rFonts w:ascii="맑은 고딕" w:hAnsi="맑은 고딕" w:eastAsia="맑은 고딕"/>
+          <w:b w:val="0"/>
+          <w:sz w:val="22"/>
+        </w:rPr>
+        <w:t>해결: 전 파일의 import를 Model 접미사가 붙은 이름으로 교체했다. 이후 같은 실수를 막기 위해 CLAUDE.md의 'Prisma 환경 메모' 섹션에 규약을 고정해 두고, 다음 프로젝트에도 동일한 메모가 상속되도록 했다.</w:t>
+      </w:r>
+    </w:p>
+    <w:p>
+      <w:pPr>
+        <w:spacing w:before="160" w:after="120"/>
+      </w:pPr>
+      <w:r>
+        <w:rPr>
+          <w:rFonts w:ascii="맑은 고딕" w:hAnsi="맑은 고딕" w:eastAsia="맑은 고딕"/>
+          <w:b/>
+          <w:color w:val="1F2D3D"/>
+          <w:sz w:val="26"/>
+        </w:rPr>
+        <w:t>10.5 prisma.config.ts의 datasource.url은 CLI 경로에서 여전히 필요</w:t>
+      </w:r>
+    </w:p>
+    <w:p>
+      <w:pPr>
+        <w:spacing w:after="120" w:line="336" w:lineRule="auto"/>
+      </w:pPr>
+      <w:r>
+        <w:rPr>
+          <w:rFonts w:ascii="맑은 고딕" w:hAnsi="맑은 고딕" w:eastAsia="맑은 고딕"/>
+          <w:b w:val="0"/>
+          <w:sz w:val="22"/>
+        </w:rPr>
+        <w:t>증상: prisma.config.ts에서 datasource 블록을 제거하자 npx prisma migrate dev가 'Environment variable not found: DATABASE_URL' 오류와 함께 실패했다.</w:t>
+      </w:r>
+    </w:p>
+    <w:p>
+      <w:pPr>
+        <w:spacing w:after="120" w:line="336" w:lineRule="auto"/>
+      </w:pPr>
+      <w:r>
+        <w:rPr>
+          <w:rFonts w:ascii="맑은 고딕" w:hAnsi="맑은 고딕" w:eastAsia="맑은 고딕"/>
+          <w:b w:val="0"/>
+          <w:sz w:val="22"/>
+        </w:rPr>
+        <w:t>원인: Prisma 7에서 deprecated된 것은 schema.prisma의 datasource.url이지, prisma.config.ts의 datasource가 아니다. CLI는 여전히 config의 datasource를 읽어 마이그레이션 대상 DB를 결정한다.</w:t>
+      </w:r>
+    </w:p>
+    <w:p>
+      <w:pPr>
+        <w:spacing w:after="120" w:line="336" w:lineRule="auto"/>
+      </w:pPr>
+      <w:r>
+        <w:rPr>
+          <w:rFonts w:ascii="맑은 고딕" w:hAnsi="맑은 고딕" w:eastAsia="맑은 고딕"/>
+          <w:b w:val="0"/>
+          <w:sz w:val="22"/>
+        </w:rPr>
+        <w:t>해결: schema.prisma에서는 datasource.url을 제거하고(런타임은 driver adapter가 담당), prisma.config.ts에는 datasource.url을 유지했다(CLI 전용). 두 레이어가 서로 다른 역할을 맡는다는 점을 인지하는 것이 핵심이었다.</w:t>
+      </w:r>
+    </w:p>
+    <w:p>
+      <w:pPr>
+        <w:spacing w:after="120" w:line="336" w:lineRule="auto"/>
+      </w:pPr>
+      <w:r>
+        <w:rPr>
+          <w:rFonts w:ascii="맑은 고딕" w:hAnsi="맑은 고딕" w:eastAsia="맑은 고딕"/>
+          <w:b w:val="0"/>
+          <w:sz w:val="22"/>
+        </w:rPr>
+        <w:t>교훈: deprecated의 범위를 레이어 단위로 정확히 구분해야 한다. 릴리스 노트만 보고 섣불리 제거하면 CLI 경로가 끊긴다. 이 교훈은 CLAUDE.md에도 함께 남겼다.</w:t>
       </w:r>
     </w:p>
     <w:p>
@@ -5374,6 +5590,75 @@
         <w:spacing w:after="80"/>
       </w:pPr>
     </w:p>
+    <w:p>
+      <w:pPr>
+        <w:spacing w:before="160" w:after="120"/>
+      </w:pPr>
+      <w:r>
+        <w:rPr>
+          <w:rFonts w:ascii="맑은 고딕" w:hAnsi="맑은 고딕" w:eastAsia="맑은 고딕"/>
+          <w:b/>
+          <w:color w:val="1F2D3D"/>
+          <w:sz w:val="26"/>
+        </w:rPr>
+        <w:t>11.5 자매 프로젝트: Cost Compass</w:t>
+      </w:r>
+    </w:p>
+    <w:p>
+      <w:pPr>
+        <w:spacing w:after="120" w:line="336" w:lineRule="auto"/>
+      </w:pPr>
+      <w:r>
+        <w:rPr>
+          <w:rFonts w:ascii="맑은 고딕" w:hAnsi="맑은 고딕" w:eastAsia="맑은 고딕"/>
+          <w:b w:val="0"/>
+          <w:sz w:val="22"/>
+        </w:rPr>
+        <w:t>Interface Hub의 CLAUDE.md를 상속받아 동일한 기술 스택으로 '분석 도구'를 만든 자매 사례다. 환경 메모가 전파된 덕분에 Phase 0부터 Phase 3까지를 반나절에 완성했다.</w:t>
+      </w:r>
+    </w:p>
+    <w:p>
+      <w:pPr>
+        <w:pStyle w:val="ListBullet"/>
+        <w:spacing w:after="40" w:line="324" w:lineRule="auto"/>
+      </w:pPr>
+      <w:r>
+        <w:rPr>
+          <w:rFonts w:ascii="맑은 고딕" w:hAnsi="맑은 고딕" w:eastAsia="맑은 고딕"/>
+          <w:b w:val="0"/>
+          <w:sz w:val="22"/>
+        </w:rPr>
+        <w:t>URL: https://cost-compass.vercel.app</w:t>
+      </w:r>
+    </w:p>
+    <w:p>
+      <w:pPr>
+        <w:pStyle w:val="ListBullet"/>
+        <w:spacing w:after="40" w:line="324" w:lineRule="auto"/>
+      </w:pPr>
+      <w:r>
+        <w:rPr>
+          <w:rFonts w:ascii="맑은 고딕" w:hAnsi="맑은 고딕" w:eastAsia="맑은 고딕"/>
+          <w:b w:val="0"/>
+          <w:sz w:val="22"/>
+        </w:rPr>
+        <w:t>저장소: https://github.com/dbwls99706/cost-compass</w:t>
+      </w:r>
+    </w:p>
+    <w:p>
+      <w:pPr>
+        <w:pStyle w:val="ListBullet"/>
+        <w:spacing w:after="40" w:line="324" w:lineRule="auto"/>
+      </w:pPr>
+      <w:r>
+        <w:rPr>
+          <w:rFonts w:ascii="맑은 고딕" w:hAnsi="맑은 고딕" w:eastAsia="맑은 고딕"/>
+          <w:b w:val="0"/>
+          <w:sz w:val="22"/>
+        </w:rPr>
+        <w:t>의의: Interface Hub에서 겪은 환경 이슈 9건이 재발하지 않음을 확인한 실증.</w:t>
+      </w:r>
+    </w:p>
     <w:sectPr>
       <w:pgSz w:w="12240" w:h="15840"/>
       <w:pgMar w:top="1134" w:right="1417" w:bottom="1134" w:left="1417" w:header="720" w:footer="720" w:gutter="0"/>

</xml_diff>